<commit_message>
Emílio Santiago: revisão parte 4
Co-Authored-By: Claude Opus 5.5 <noreply@anthropic.com>
Claude-Session: https://claude.ai/code/session_01MJjUEEZrxQDEUifKK2vj9g
</commit_message>
<xml_diff>
--- a/roteiros/emilio-santiago/EmilioSantiago_Parte4.docx
+++ b/roteiros/emilio-santiago/EmilioSantiago_Parte4.docx
@@ -199,7 +199,7 @@
         <w:rPr>
           <w:color w:val="000000"/>
         </w:rPr>
-        <w:t>Aleksander chamava Hercília de tia. Dizia que ela tinha documentos e fotos, e que sabia que era irmã do pai dele.</w:t>
+        <w:t>Aleksander tratava Hercília como tia. "Ela está documentada, tem fotos e tudo o mais, sabe que é irmã do meu pai", disse ele.</w:t>
       </w:r>
     </w:p>
     <w:p>
@@ -239,7 +239,7 @@
         <w:rPr>
           <w:color w:val="C00000"/>
         </w:rPr>
-        <w:t>O que veio a seguir foi uma decisão que o Brasil nunca tinha visto envolvendo um cantor daquele tamanho. Porque, quando os exames falharam, restou só o corpo de Emílio Santiago. E um juiz ia ter que decidir se aquele túmulo no Caju podia ser aberto.</w:t>
+        <w:t>O que veio a seguir foi uma decisão raríssima envolvendo um cantor daquele tamanho. Porque, quando os exames falharam, restou só o corpo de Emílio Santiago. E um juiz ia ter que decidir se aquele túmulo no Caju podia ser aberto.</w:t>
       </w:r>
     </w:p>
     <w:p>
@@ -471,7 +471,7 @@
         <w:rPr>
           <w:color w:val="C00000"/>
         </w:rPr>
-        <w:t>Só que o resultado não veio em trinta dias. E, enquanto o laudo não chegava, a guerra ganhou outra frente. Uma frente tão suja que envolveu uma das maiores cantoras do país. E acusações que ninguém esperava ver escritas num processo sobre Emílio Santiago.</w:t>
+        <w:t>Só que o resultado não veio em trinta dias. E, nos meses seguintes à exumação, a guerra ganhou outra frente. Uma frente tão suja que envolveu uma das maiores cantoras do país. E acusações que ninguém esperava ver escritas num processo sobre Emílio Santiago.</w:t>
       </w:r>
     </w:p>
     <w:p>
@@ -479,7 +479,7 @@
         <w:rPr>
           <w:color w:val="1F4EB4"/>
         </w:rPr>
-        <w:t>Enquanto o Brasil esperava o DNA, Hercília Santiago partiu para o ataque.</w:t>
+        <w:t>No começo de dois mil e vinte e três, Hercília Santiago partiu para o ataque.</w:t>
       </w:r>
     </w:p>
     <w:p>
@@ -519,7 +519,7 @@
         <w:rPr>
           <w:color w:val="1F4EB4"/>
         </w:rPr>
-        <w:t>Mas, junto com essas acusações, veio um detalhe que ninguém tinha percebido. E ele envolvia Alcione.</w:t>
+        <w:t>Junto com essas acusações, apareceu no processo um detalhe envolvendo Alcione.</w:t>
       </w:r>
     </w:p>
     <w:p>
@@ -573,17 +573,9 @@
     <w:p>
       <w:r>
         <w:rPr>
-          <w:color w:val="1F4EB4"/>
-        </w:rPr>
-        <w:t>Aquela contradição mostra o tamanho do silêncio que cercava a vida dele. Até uma das amigas mais próximas dizia uma coisa em público e outra num documento.</w:t>
-      </w:r>
-    </w:p>
-    <w:p>
-      <w:r>
-        <w:rPr>
           <w:color w:val="C00000"/>
         </w:rPr>
-        <w:t>Enquanto os advogados discutiam assinaturas e fundações, um envelope saía de um laboratório. Dentro dele estava o laudo com o DNA tirado do túmulo de Emílio Santiago. Um único número ia decidir quem estava mentindo naquela guerra. E esse número, quando foi revelado, deixou o Brasil sem reação.</w:t>
+        <w:t>No meio dessa briga de assinaturas e fundações, um envelope saiu de um laboratório. Dentro dele estava o laudo com o DNA tirado do túmulo de Emílio Santiago. Um único número ia decidir se Aleksander era ou não filho do cantor. E esse número, quando foi revelado, deixou o Brasil sem reação.</w:t>
       </w:r>
     </w:p>
     <w:sectPr>

</xml_diff>